<commit_message>
Adição de pagina de elaboração do relatorio e user
</commit_message>
<xml_diff>
--- a/assets/templates/modelo_ar_comprimido.docx
+++ b/assets/templates/modelo_ar_comprimido.docx
@@ -26148,6 +26148,286 @@
         </w:tc>
       </w:tr>
     </w:tbl>
+    <w:p>
+      <w:pPr>
+        <w:spacing w:before="240"/>
+      </w:pPr>
+      <w:r>
+        <w:rPr>
+          <w:b/>
+          <w:sz w:val="24"/>
+        </w:rPr>
+        <w:t>Salas</w:t>
+      </w:r>
+    </w:p>
+    <w:tbl>
+      <w:tblPr>
+        <w:tblW w:w="0" w:type="auto"/>
+        <w:tblBorders>
+          <w:top w:val="single" w:sz="4" w:space="0" w:color="auto"/>
+          <w:left w:val="single" w:sz="4" w:space="0" w:color="auto"/>
+          <w:bottom w:val="single" w:sz="4" w:space="0" w:color="auto"/>
+          <w:right w:val="single" w:sz="4" w:space="0" w:color="auto"/>
+          <w:insideH w:val="single" w:sz="4" w:space="0" w:color="auto"/>
+          <w:insideV w:val="single" w:sz="4" w:space="0" w:color="auto"/>
+        </w:tblBorders>
+      </w:tblPr>
+      <w:tblGrid>
+        <w:gridCol w:w="2200"/>
+        <w:gridCol w:w="1600"/>
+        <w:gridCol w:w="1600"/>
+        <w:gridCol w:w="1200"/>
+        <w:gridCol w:w="1600"/>
+      </w:tblGrid>
+      <w:tr>
+        <w:tc>
+          <w:tcPr>
+            <w:tcW w:w="2200" w:type="dxa"/>
+          </w:tcPr>
+          <w:p>
+            <w:r>
+              <w:rPr>
+                <w:b/>
+              </w:rPr>
+              <w:t>Sala</w:t>
+            </w:r>
+          </w:p>
+        </w:tc>
+        <w:tc>
+          <w:tcPr>
+            <w:tcW w:w="1600" w:type="dxa"/>
+          </w:tcPr>
+          <w:p>
+            <w:r>
+              <w:rPr>
+                <w:b/>
+              </w:rPr>
+              <w:t>Area (m2)</w:t>
+            </w:r>
+          </w:p>
+        </w:tc>
+        <w:tc>
+          <w:tcPr>
+            <w:tcW w:w="1600" w:type="dxa"/>
+          </w:tcPr>
+          <w:p>
+            <w:r>
+              <w:rPr>
+                <w:b/>
+              </w:rPr>
+              <w:t>Volume (m3)</w:t>
+            </w:r>
+          </w:p>
+        </w:tc>
+        <w:tc>
+          <w:tcPr>
+            <w:tcW w:w="1200" w:type="dxa"/>
+          </w:tcPr>
+          <w:p>
+            <w:r>
+              <w:rPr>
+                <w:b/>
+              </w:rPr>
+              <w:t>Grau</w:t>
+            </w:r>
+          </w:p>
+        </w:tc>
+        <w:tc>
+          <w:tcPr>
+            <w:tcW w:w="1600" w:type="dxa"/>
+          </w:tcPr>
+          <w:p>
+            <w:r>
+              <w:rPr>
+                <w:b/>
+              </w:rPr>
+              <w:t>Difusores</w:t>
+            </w:r>
+          </w:p>
+        </w:tc>
+      </w:tr>
+      <w:tr>
+        <w:tc>
+          <w:tcPr>
+            <w:tcW w:w="2200" w:type="dxa"/>
+          </w:tcPr>
+          <w:p>
+            <w:r>
+              <w:t>{#salas}{nome}</w:t>
+            </w:r>
+          </w:p>
+        </w:tc>
+        <w:tc>
+          <w:tcPr>
+            <w:tcW w:w="1600" w:type="dxa"/>
+          </w:tcPr>
+          <w:p>
+            <w:r>
+              <w:t>{area}</w:t>
+            </w:r>
+          </w:p>
+        </w:tc>
+        <w:tc>
+          <w:tcPr>
+            <w:tcW w:w="1600" w:type="dxa"/>
+          </w:tcPr>
+          <w:p>
+            <w:r>
+              <w:t>{volume}</w:t>
+            </w:r>
+          </w:p>
+        </w:tc>
+        <w:tc>
+          <w:tcPr>
+            <w:tcW w:w="1200" w:type="dxa"/>
+          </w:tcPr>
+          <w:p>
+            <w:r>
+              <w:t>{grau}</w:t>
+            </w:r>
+          </w:p>
+        </w:tc>
+        <w:tc>
+          <w:tcPr>
+            <w:tcW w:w="1600" w:type="dxa"/>
+          </w:tcPr>
+          <w:p>
+            <w:r>
+              <w:t>{qtdDifusores}{/salas}</w:t>
+            </w:r>
+          </w:p>
+        </w:tc>
+      </w:tr>
+    </w:tbl>
+    <w:p/>
+    <w:p>
+      <w:pPr>
+        <w:spacing w:before="240"/>
+      </w:pPr>
+      <w:r>
+        <w:rPr>
+          <w:b/>
+          <w:sz w:val="24"/>
+        </w:rPr>
+        <w:t>Handling Units</w:t>
+      </w:r>
+    </w:p>
+    <w:tbl>
+      <w:tblPr>
+        <w:tblW w:w="0" w:type="auto"/>
+        <w:tblBorders>
+          <w:top w:val="single" w:sz="4" w:space="0" w:color="auto"/>
+          <w:left w:val="single" w:sz="4" w:space="0" w:color="auto"/>
+          <w:bottom w:val="single" w:sz="4" w:space="0" w:color="auto"/>
+          <w:right w:val="single" w:sz="4" w:space="0" w:color="auto"/>
+          <w:insideH w:val="single" w:sz="4" w:space="0" w:color="auto"/>
+          <w:insideV w:val="single" w:sz="4" w:space="0" w:color="auto"/>
+        </w:tblBorders>
+      </w:tblPr>
+      <w:tblGrid>
+        <w:gridCol w:w="2200"/>
+        <w:gridCol w:w="2000"/>
+        <w:gridCol w:w="2000"/>
+        <w:gridCol w:w="2000"/>
+      </w:tblGrid>
+      <w:tr>
+        <w:tc>
+          <w:tcPr>
+            <w:tcW w:w="2200" w:type="dxa"/>
+          </w:tcPr>
+          <w:p>
+            <w:r>
+              <w:rPr>
+                <w:b/>
+              </w:rPr>
+              <w:t>Handling Unit</w:t>
+            </w:r>
+          </w:p>
+        </w:tc>
+        <w:tc>
+          <w:tcPr>
+            <w:tcW w:w="2000" w:type="dxa"/>
+          </w:tcPr>
+          <w:p>
+            <w:r>
+              <w:rPr>
+                <w:b/>
+              </w:rPr>
+              <w:t>Filtro Terminal</w:t>
+            </w:r>
+          </w:p>
+        </w:tc>
+        <w:tc>
+          <w:tcPr>
+            <w:tcW w:w="2000" w:type="dxa"/>
+          </w:tcPr>
+          <w:p>
+            <w:r>
+              <w:rPr>
+                <w:b/>
+              </w:rPr>
+              <w:t>Qtd. Filtros Terminais</w:t>
+            </w:r>
+          </w:p>
+        </w:tc>
+        <w:tc>
+          <w:tcPr>
+            <w:tcW w:w="2000" w:type="dxa"/>
+          </w:tcPr>
+          <w:p>
+            <w:r>
+              <w:rPr>
+                <w:b/>
+              </w:rPr>
+              <w:t>Filtros</w:t>
+            </w:r>
+          </w:p>
+        </w:tc>
+      </w:tr>
+      <w:tr>
+        <w:tc>
+          <w:tcPr>
+            <w:tcW w:w="2200" w:type="dxa"/>
+          </w:tcPr>
+          <w:p>
+            <w:r>
+              <w:t>{#handlingUnits}{nome}</w:t>
+            </w:r>
+          </w:p>
+        </w:tc>
+        <w:tc>
+          <w:tcPr>
+            <w:tcW w:w="2000" w:type="dxa"/>
+          </w:tcPr>
+          <w:p>
+            <w:r>
+              <w:t>{temFiltroTerminalTexto}</w:t>
+            </w:r>
+          </w:p>
+        </w:tc>
+        <w:tc>
+          <w:tcPr>
+            <w:tcW w:w="2000" w:type="dxa"/>
+          </w:tcPr>
+          <w:p>
+            <w:r>
+              <w:t>{qtdFiltrosTerminais}</w:t>
+            </w:r>
+          </w:p>
+        </w:tc>
+        <w:tc>
+          <w:tcPr>
+            <w:tcW w:w="2000" w:type="dxa"/>
+          </w:tcPr>
+          <w:p>
+            <w:r>
+              <w:t>{#filtros}{tipo}: {quantidade}un. {/filtros}{/handlingUnits}</w:t>
+            </w:r>
+          </w:p>
+        </w:tc>
+      </w:tr>
+    </w:tbl>
+    <w:p/>
     <w:sectPr>
       <w:pgSz w:w="11910" w:h="16840"/>
       <w:pgMar w:header="566" w:footer="320" w:top="1540" w:bottom="520" w:left="708" w:right="566"/>

</xml_diff>